<commit_message>
troca as duas figuras sintéticas por quatro artefatos reais do projeto
- Figura 3: fluxo de emissão no n8n (tcc_juliana p.20)
- Figura 4: relatório de perfil, radar e níveis (manuscrito 2024 p.17)
- Figuras 5 e 6: frente e verso do modelo de certificado (tcc_juliana p.22)

scripts/figuras_reais.py extrai as imagens embutidas com pdfimages, sem
rasterizar, e aplica as supressões: nome de discente, identificação
institucional e nomes de servidores (avaliação cega) e endereços de endpoint.
Todas acima de 300 dpi.

Corrige 3.6, que afirmava não haver captura de tela no artigo.

D-30: teto elevado a 20 páginas por decisão do autor. O documento está em 19,
acima das 18 da revista — o gate avisa a cada execução.

Co-Authored-By: Claude Opus 5 <noreply@anthropic.com>
Claude-Session: https://claude.ai/code/session_01XNaMqyCQ4fzjdFJ9W5G7SS
</commit_message>
<xml_diff>
--- a/build/artigo.docx
+++ b/build/artigo.docx
@@ -3215,19 +3215,19 @@
         <w:pStyle w:val="BodyText"/>
       </w:pPr>
       <w:r>
-        <w:t xml:space="preserve">A emissão do documento é conduzida pelo quarto fluxo de automação. Após autenticar-se na</w:t>
-      </w:r>
-      <w:r>
-        <w:t xml:space="preserve"> </w:t>
-      </w:r>
-      <w:r>
-        <w:t xml:space="preserve">interface, o fluxo percorre a relação de discentes em lote e normaliza a capitalização do</w:t>
-      </w:r>
-      <w:r>
-        <w:t xml:space="preserve"> </w:t>
-      </w:r>
-      <w:r>
-        <w:t xml:space="preserve">nome, que é armazenado em caixa baixa na origem. Em seguida preenche um modelo de</w:t>
+        <w:t xml:space="preserve">A emissão do documento é conduzida pelo quarto fluxo de automação, reproduzido na</w:t>
+      </w:r>
+      <w:r>
+        <w:t xml:space="preserve"> </w:t>
+      </w:r>
+      <w:r>
+        <w:t xml:space="preserve">Figura 3. Após autenticar-se na interface, o fluxo percorre a relação de discentes em</w:t>
+      </w:r>
+      <w:r>
+        <w:t xml:space="preserve"> </w:t>
+      </w:r>
+      <w:r>
+        <w:t xml:space="preserve">lote e normaliza a capitalização do nome, que é armazenado em caixa baixa na origem. Em seguida preenche um modelo de</w:t>
       </w:r>
       <w:r>
         <w:t xml:space="preserve"> </w:t>
@@ -3274,13 +3274,76 @@
     </w:p>
     <w:p>
       <w:pPr>
+        <w:pStyle w:val="BodyText"/>
+      </w:pPr>
+      <w:r>
+        <w:drawing>
+          <wp:inline>
+            <wp:extent cx="5334000" cy="1361009"/>
+            <wp:effectExtent b="0" l="0" r="0" t="0"/>
+            <wp:docPr descr="" title="" id="1" name="Picture"/>
+            <a:graphic>
+              <a:graphicData uri="http://schemas.openxmlformats.org/drawingml/2006/picture">
+                <pic:pic>
+                  <pic:nvPicPr>
+                    <pic:cNvPr descr="figuras/fig-03-3.png" id="0" name="Picture"/>
+                    <pic:cNvPicPr>
+                      <a:picLocks noChangeArrowheads="1" noChangeAspect="1"/>
+                    </pic:cNvPicPr>
+                  </pic:nvPicPr>
+                  <pic:blipFill>
+                    <a:blip r:embed="rId37"/>
+                    <a:stretch>
+                      <a:fillRect/>
+                    </a:stretch>
+                  </pic:blipFill>
+                  <pic:spPr bwMode="auto">
+                    <a:xfrm>
+                      <a:off x="0" y="0"/>
+                      <a:ext cx="5334000" cy="1361009"/>
+                    </a:xfrm>
+                    <a:prstGeom prst="rect">
+                      <a:avLst/>
+                    </a:prstGeom>
+                    <a:noFill/>
+                    <a:ln w="9525">
+                      <a:noFill/>
+                      <a:headEnd/>
+                      <a:tailEnd/>
+                    </a:ln>
+                  </pic:spPr>
+                </pic:pic>
+              </a:graphicData>
+            </a:graphic>
+          </wp:inline>
+        </w:drawing>
+      </w:r>
+    </w:p>
+    <w:p>
+      <w:pPr>
+        <w:pStyle w:val="Legenda"/>
+      </w:pPr>
+      <w:r>
+        <w:t xml:space="preserve">Figura 3 — Fluxo de emissão de certificados construído na ferramenta de automação, do gatilho manual à conversão em PDF e à concessão de permissões. Endereços de serviço suprimidos.</w:t>
+      </w:r>
+    </w:p>
+    <w:p>
+      <w:pPr>
+        <w:pStyle w:val="FonteIlustracao"/>
+      </w:pPr>
+      <w:r>
+        <w:t xml:space="preserve">Fonte: dados da pesquisa.</w:t>
+      </w:r>
+    </w:p>
+    <w:p>
+      <w:pPr>
         <w:pStyle w:val="Heading3"/>
       </w:pPr>
-      <w:bookmarkStart w:id="37" w:name="X1b424eb77056e7c315bd9f8d1b751b10aeb7605"/>
+      <w:bookmarkStart w:id="38" w:name="X1b424eb77056e7c315bd9f8d1b751b10aeb7605"/>
       <w:r>
         <w:t xml:space="preserve">3.5 Camada de intervenção: a regra de recomendação pedagógica</w:t>
       </w:r>
-      <w:bookmarkEnd w:id="37"/>
+      <w:bookmarkEnd w:id="38"/>
     </w:p>
     <w:p>
       <w:pPr>
@@ -3424,11 +3487,11 @@
       <w:pPr>
         <w:pStyle w:val="Heading3"/>
       </w:pPr>
-      <w:bookmarkStart w:id="38" w:name="X96218a0cfe79e2a8e3d58ce5a3560ef33371d22"/>
+      <w:bookmarkStart w:id="39" w:name="X96218a0cfe79e2a8e3d58ce5a3560ef33371d22"/>
       <w:r>
         <w:t xml:space="preserve">3.6 Tratamento dos dados e procedimentos éticos</w:t>
       </w:r>
-      <w:bookmarkEnd w:id="38"/>
+      <w:bookmarkEnd w:id="39"/>
     </w:p>
     <w:p>
       <w:pPr>
@@ -3485,42 +3548,48 @@
         <w:t xml:space="preserve"> </w:t>
       </w:r>
       <w:r>
-        <w:t xml:space="preserve">Nenhum dado individual de discente é reportado no texto, nas tabelas ou nas figuras, e as</w:t>
-      </w:r>
-      <w:r>
-        <w:t xml:space="preserve"> </w:t>
-      </w:r>
-      <w:r>
-        <w:t xml:space="preserve">ilustrações foram redesenhadas como diagramas esquemáticos em lugar de capturas de tela,</w:t>
-      </w:r>
-      <w:r>
-        <w:t xml:space="preserve"> </w:t>
-      </w:r>
-      <w:r>
-        <w:t xml:space="preserve">justamente para eliminar a via mais provável de exposição acidental. Os identificadores de</w:t>
-      </w:r>
-      <w:r>
-        <w:t xml:space="preserve"> </w:t>
-      </w:r>
-      <w:r>
-        <w:t xml:space="preserve">infraestrutura, como nomes de servidor e credenciais de acesso, permanecem em variáveis de</w:t>
-      </w:r>
-      <w:r>
-        <w:t xml:space="preserve"> </w:t>
-      </w:r>
-      <w:r>
-        <w:t xml:space="preserve">ambiente e não são reproduzidos aqui.</w:t>
+        <w:t xml:space="preserve">Nenhum dado individual de discente é reportado no texto, nas tabelas ou nas figuras. As</w:t>
+      </w:r>
+      <w:r>
+        <w:t xml:space="preserve"> </w:t>
+      </w:r>
+      <w:r>
+        <w:t xml:space="preserve">capturas de tela reproduzidas foram tratadas antes de entrar no artigo, com supressão do</w:t>
+      </w:r>
+      <w:r>
+        <w:t xml:space="preserve"> </w:t>
+      </w:r>
+      <w:r>
+        <w:t xml:space="preserve">nome do discente no relatório de perfil, e o modelo de certificado aparece com as marcações</w:t>
+      </w:r>
+      <w:r>
+        <w:t xml:space="preserve"> </w:t>
+      </w:r>
+      <w:r>
+        <w:t xml:space="preserve">de substituição ainda no lugar dos dados que o fluxo insere na emissão. Os identificadores</w:t>
+      </w:r>
+      <w:r>
+        <w:t xml:space="preserve"> </w:t>
+      </w:r>
+      <w:r>
+        <w:t xml:space="preserve">de infraestrutura, como nomes de servidor e credenciais de acesso, permanecem em variáveis</w:t>
+      </w:r>
+      <w:r>
+        <w:t xml:space="preserve"> </w:t>
+      </w:r>
+      <w:r>
+        <w:t xml:space="preserve">de ambiente e foram suprimidos das figuras em que apareciam.</w:t>
       </w:r>
     </w:p>
     <w:p>
       <w:pPr>
         <w:pStyle w:val="Heading2"/>
       </w:pPr>
-      <w:bookmarkStart w:id="39" w:name="resultados-e-discussões"/>
+      <w:bookmarkStart w:id="40" w:name="resultados-e-discussões"/>
       <w:r>
         <w:t xml:space="preserve">4 Resultados e discussões</w:t>
       </w:r>
-      <w:bookmarkEnd w:id="39"/>
+      <w:bookmarkEnd w:id="40"/>
     </w:p>
     <w:p>
       <w:pPr>
@@ -3620,11 +3689,11 @@
       <w:pPr>
         <w:pStyle w:val="Heading3"/>
       </w:pPr>
-      <w:bookmarkStart w:id="40" w:name="Xe60b372d3dfb883306b8f4f6f44c96d36304449"/>
+      <w:bookmarkStart w:id="41" w:name="Xe60b372d3dfb883306b8f4f6f44c96d36304449"/>
       <w:r>
         <w:t xml:space="preserve">4.1 A base de dados constituída no ciclo de 2025</w:t>
       </w:r>
-      <w:bookmarkEnd w:id="40"/>
+      <w:bookmarkEnd w:id="41"/>
     </w:p>
     <w:p>
       <w:pPr>
@@ -4324,11 +4393,11 @@
       <w:pPr>
         <w:pStyle w:val="Heading3"/>
       </w:pPr>
-      <w:bookmarkStart w:id="41" w:name="Xc80a5d285d2374a13b72f4c5d054adf8e2400ee"/>
+      <w:bookmarkStart w:id="42" w:name="Xc80a5d285d2374a13b72f4c5d054adf8e2400ee"/>
       <w:r>
         <w:t xml:space="preserve">4.2 Cobertura longitudinal e computabilidade da regra de certificação</w:t>
       </w:r>
-      <w:bookmarkEnd w:id="41"/>
+      <w:bookmarkEnd w:id="42"/>
     </w:p>
     <w:p>
       <w:pPr>
@@ -4467,25 +4536,37 @@
         <w:pStyle w:val="BodyText"/>
       </w:pPr>
       <w:r>
-        <w:t xml:space="preserve">A forma como essa comparação chega ao mentor está reproduzida na Figura 3,</w:t>
-      </w:r>
-      <w:r>
-        <w:t xml:space="preserve"> </w:t>
-      </w:r>
-      <w:r>
-        <w:t xml:space="preserve">construída com dados sintéticos: o gráfico de perfil sobrepõe as medições de duas</w:t>
-      </w:r>
-      <w:r>
-        <w:t xml:space="preserve"> </w:t>
-      </w:r>
-      <w:r>
-        <w:t xml:space="preserve">unidades sucessivas sobre os mesmos eixos, e é dessa sobreposição que tanto a leitura</w:t>
-      </w:r>
-      <w:r>
-        <w:t xml:space="preserve"> </w:t>
-      </w:r>
-      <w:r>
-        <w:t xml:space="preserve">humana quanto as duas regras extraem a variação de cada competência.</w:t>
+        <w:t xml:space="preserve">A forma como essa comparação chega ao mentor está na Figura 4, um relatório</w:t>
+      </w:r>
+      <w:r>
+        <w:t xml:space="preserve"> </w:t>
+      </w:r>
+      <w:r>
+        <w:t xml:space="preserve">efetivamente produzido pelo fluxo de geração de gráficos, aqui em uma execução de outubro</w:t>
+      </w:r>
+      <w:r>
+        <w:t xml:space="preserve"> </w:t>
+      </w:r>
+      <w:r>
+        <w:t xml:space="preserve">de 2024. As avaliações sucessivas de um mesmo discente aparecem sobrepostas nos mesmos</w:t>
+      </w:r>
+      <w:r>
+        <w:t xml:space="preserve"> </w:t>
+      </w:r>
+      <w:r>
+        <w:t xml:space="preserve">eixos, e a tabela ao lado converte cada medição no nível qualitativo correspondente. É</w:t>
+      </w:r>
+      <w:r>
+        <w:t xml:space="preserve"> </w:t>
+      </w:r>
+      <w:r>
+        <w:t xml:space="preserve">dessa sobreposição que tanto a leitura humana quanto as duas regras extraem a variação de</w:t>
+      </w:r>
+      <w:r>
+        <w:t xml:space="preserve"> </w:t>
+      </w:r>
+      <w:r>
+        <w:t xml:space="preserve">cada competência.</w:t>
       </w:r>
     </w:p>
     <w:p>
@@ -4495,7 +4576,7 @@
       <w:r>
         <w:drawing>
           <wp:inline>
-            <wp:extent cx="5334000" cy="2998786"/>
+            <wp:extent cx="4674249" cy="2962305"/>
             <wp:effectExtent b="0" l="0" r="0" t="0"/>
             <wp:docPr descr="" title="" id="1" name="Picture"/>
             <a:graphic>
@@ -4508,7 +4589,7 @@
                     </pic:cNvPicPr>
                   </pic:nvPicPr>
                   <pic:blipFill>
-                    <a:blip r:embed="rId42"/>
+                    <a:blip r:embed="rId43"/>
                     <a:stretch>
                       <a:fillRect/>
                     </a:stretch>
@@ -4516,7 +4597,7 @@
                   <pic:spPr bwMode="auto">
                     <a:xfrm>
                       <a:off x="0" y="0"/>
-                      <a:ext cx="5334000" cy="2998786"/>
+                      <a:ext cx="4674249" cy="2962305"/>
                     </a:xfrm>
                     <a:prstGeom prst="rect">
                       <a:avLst/>
@@ -4540,7 +4621,7 @@
         <w:pStyle w:val="Legenda"/>
       </w:pPr>
       <w:r>
-        <w:t xml:space="preserve">Figura 3 — Gráfico de perfil de competências macro, com duas unidades sucessivas sobrepostas em escala de 0 a 4. Exemplo sintético, construído para ilustrar o formato da saída, sem dado de discente.</w:t>
+        <w:t xml:space="preserve">Figura 4 — Relatório de perfil produzido pelo fluxo de geração de gráficos, com três avaliações sucessivas sobrepostas nos eixos das competências e a tabela dos níveis qualitativos correspondentes. Nome do discente suprimido.</w:t>
       </w:r>
     </w:p>
     <w:p>
@@ -4548,7 +4629,7 @@
         <w:pStyle w:val="FonteIlustracao"/>
       </w:pPr>
       <w:r>
-        <w:t xml:space="preserve">Fonte: elaborado pelos autores.</w:t>
+        <w:t xml:space="preserve">Fonte: dados da pesquisa.</w:t>
       </w:r>
     </w:p>
     <w:p>
@@ -4655,11 +4736,11 @@
       <w:pPr>
         <w:pStyle w:val="Heading3"/>
       </w:pPr>
-      <w:bookmarkStart w:id="43" w:name="X4c2c2f052d6b2bf03a9e2fdbda407addf68e42a"/>
+      <w:bookmarkStart w:id="44" w:name="X4c2c2f052d6b2bf03a9e2fdbda407addf68e42a"/>
       <w:r>
         <w:t xml:space="preserve">4.3 Comportamento observado das camadas de decisão e de intervenção</w:t>
       </w:r>
-      <w:bookmarkEnd w:id="43"/>
+      <w:bookmarkEnd w:id="44"/>
     </w:p>
     <w:p>
       <w:pPr>
@@ -4760,31 +4841,43 @@
         <w:pStyle w:val="BodyText"/>
       </w:pPr>
       <w:r>
-        <w:t xml:space="preserve">Os artefatos que as duas camadas entregam estão reproduzidos na Figura 4, também</w:t>
-      </w:r>
-      <w:r>
-        <w:t xml:space="preserve"> </w:t>
-      </w:r>
-      <w:r>
-        <w:t xml:space="preserve">em exemplos sintéticos, uma vez que nenhum documento emitido para discente real pode ser</w:t>
-      </w:r>
-      <w:r>
-        <w:t xml:space="preserve"> </w:t>
-      </w:r>
-      <w:r>
-        <w:t xml:space="preserve">reproduzido em publicação aberta. O certificado registra a participação no programa, e a</w:t>
-      </w:r>
-      <w:r>
-        <w:t xml:space="preserve"> </w:t>
-      </w:r>
-      <w:r>
-        <w:t xml:space="preserve">mensagem de recomendação nomeia a competência apontada, a condição que disparou o</w:t>
-      </w:r>
-      <w:r>
-        <w:t xml:space="preserve"> </w:t>
-      </w:r>
-      <w:r>
-        <w:t xml:space="preserve">apontamento e a prática sugerida.</w:t>
+        <w:t xml:space="preserve">O documento que a camada de emissão produz está na Figura 5 e na Figura 6, que</w:t>
+      </w:r>
+      <w:r>
+        <w:t xml:space="preserve"> </w:t>
+      </w:r>
+      <w:r>
+        <w:t xml:space="preserve">reproduzem a frente e o verso do modelo preenchido pelo fluxo. O que aparece nos campos é</w:t>
+      </w:r>
+      <w:r>
+        <w:t xml:space="preserve"> </w:t>
+      </w:r>
+      <w:r>
+        <w:t xml:space="preserve">a marcação que o fluxo substitui pelos dados de cada discente no momento da emissão, e não</w:t>
+      </w:r>
+      <w:r>
+        <w:t xml:space="preserve"> </w:t>
+      </w:r>
+      <w:r>
+        <w:t xml:space="preserve">um certificado emitido: reproduzir um documento já preenchido exporia nome e número de</w:t>
+      </w:r>
+      <w:r>
+        <w:t xml:space="preserve"> </w:t>
+      </w:r>
+      <w:r>
+        <w:t xml:space="preserve">inscrição no cadastro de pessoas físicas. A frente registra a participação no programa e o</w:t>
+      </w:r>
+      <w:r>
+        <w:t xml:space="preserve"> </w:t>
+      </w:r>
+      <w:r>
+        <w:t xml:space="preserve">projeto ao qual o discente esteve vinculado, e o verso enumera as competências</w:t>
+      </w:r>
+      <w:r>
+        <w:t xml:space="preserve"> </w:t>
+      </w:r>
+      <w:r>
+        <w:t xml:space="preserve">socioemocionais trabalhadas no percurso.</w:t>
       </w:r>
     </w:p>
     <w:p>
@@ -4794,7 +4887,7 @@
       <w:r>
         <w:drawing>
           <wp:inline>
-            <wp:extent cx="5334000" cy="2332389"/>
+            <wp:extent cx="4150425" cy="2936174"/>
             <wp:effectExtent b="0" l="0" r="0" t="0"/>
             <wp:docPr descr="" title="" id="1" name="Picture"/>
             <a:graphic>
@@ -4807,7 +4900,7 @@
                     </pic:cNvPicPr>
                   </pic:nvPicPr>
                   <pic:blipFill>
-                    <a:blip r:embed="rId44"/>
+                    <a:blip r:embed="rId45"/>
                     <a:stretch>
                       <a:fillRect/>
                     </a:stretch>
@@ -4815,7 +4908,7 @@
                   <pic:spPr bwMode="auto">
                     <a:xfrm>
                       <a:off x="0" y="0"/>
-                      <a:ext cx="5334000" cy="2332389"/>
+                      <a:ext cx="4150425" cy="2936174"/>
                     </a:xfrm>
                     <a:prstGeom prst="rect">
                       <a:avLst/>
@@ -4839,7 +4932,7 @@
         <w:pStyle w:val="Legenda"/>
       </w:pPr>
       <w:r>
-        <w:t xml:space="preserve">Figura 4 — Certificado de participação e mensagem de recomendação pedagógica, os dois artefatos entregues pelas camadas de decisão e de intervenção. Exemplos sintéticos, sem dado de discente.</w:t>
+        <w:t xml:space="preserve">Figura 5 — Frente do modelo de certificado preenchido pelo fluxo de emissão. Os campos entre chaves são substituídos pelos dados do discente na emissão. Identificação institucional suprimida em razão da avaliação cega.</w:t>
       </w:r>
     </w:p>
     <w:p>
@@ -4847,7 +4940,70 @@
         <w:pStyle w:val="FonteIlustracao"/>
       </w:pPr>
       <w:r>
-        <w:t xml:space="preserve">Fonte: elaborado pelos autores.</w:t>
+        <w:t xml:space="preserve">Fonte: dados da pesquisa.</w:t>
+      </w:r>
+    </w:p>
+    <w:p>
+      <w:pPr>
+        <w:pStyle w:val="BodyText"/>
+      </w:pPr>
+      <w:r>
+        <w:drawing>
+          <wp:inline>
+            <wp:extent cx="4150425" cy="2930236"/>
+            <wp:effectExtent b="0" l="0" r="0" t="0"/>
+            <wp:docPr descr="" title="" id="1" name="Picture"/>
+            <a:graphic>
+              <a:graphicData uri="http://schemas.openxmlformats.org/drawingml/2006/picture">
+                <pic:pic>
+                  <pic:nvPicPr>
+                    <pic:cNvPr descr="figuras/fig-04-3.png" id="0" name="Picture"/>
+                    <pic:cNvPicPr>
+                      <a:picLocks noChangeArrowheads="1" noChangeAspect="1"/>
+                    </pic:cNvPicPr>
+                  </pic:nvPicPr>
+                  <pic:blipFill>
+                    <a:blip r:embed="rId46"/>
+                    <a:stretch>
+                      <a:fillRect/>
+                    </a:stretch>
+                  </pic:blipFill>
+                  <pic:spPr bwMode="auto">
+                    <a:xfrm>
+                      <a:off x="0" y="0"/>
+                      <a:ext cx="4150425" cy="2930236"/>
+                    </a:xfrm>
+                    <a:prstGeom prst="rect">
+                      <a:avLst/>
+                    </a:prstGeom>
+                    <a:noFill/>
+                    <a:ln w="9525">
+                      <a:noFill/>
+                      <a:headEnd/>
+                      <a:tailEnd/>
+                    </a:ln>
+                  </pic:spPr>
+                </pic:pic>
+              </a:graphicData>
+            </a:graphic>
+          </wp:inline>
+        </w:drawing>
+      </w:r>
+    </w:p>
+    <w:p>
+      <w:pPr>
+        <w:pStyle w:val="Legenda"/>
+      </w:pPr>
+      <w:r>
+        <w:t xml:space="preserve">Figura 6 — Verso do modelo de certificado, com a relação das competências socioemocionais trabalhadas no percurso formativo. Identificação institucional suprimida em razão da avaliação cega.</w:t>
+      </w:r>
+    </w:p>
+    <w:p>
+      <w:pPr>
+        <w:pStyle w:val="FonteIlustracao"/>
+      </w:pPr>
+      <w:r>
+        <w:t xml:space="preserve">Fonte: dados da pesquisa.</w:t>
       </w:r>
     </w:p>
     <w:p>
@@ -4898,11 +5054,11 @@
       <w:pPr>
         <w:pStyle w:val="Heading3"/>
       </w:pPr>
-      <w:bookmarkStart w:id="45" w:name="tempo-de-execução"/>
+      <w:bookmarkStart w:id="47" w:name="tempo-de-execução"/>
       <w:r>
         <w:t xml:space="preserve">4.4 Tempo de execução</w:t>
       </w:r>
-      <w:bookmarkEnd w:id="45"/>
+      <w:bookmarkEnd w:id="47"/>
     </w:p>
     <w:p>
       <w:pPr>
@@ -5343,11 +5499,11 @@
       <w:pPr>
         <w:pStyle w:val="Heading3"/>
       </w:pPr>
-      <w:bookmarkStart w:id="46" w:name="discussão"/>
+      <w:bookmarkStart w:id="48" w:name="discussão"/>
       <w:r>
         <w:t xml:space="preserve">4.5 Discussão</w:t>
       </w:r>
-      <w:bookmarkEnd w:id="46"/>
+      <w:bookmarkEnd w:id="48"/>
     </w:p>
     <w:p>
       <w:pPr>
@@ -5695,11 +5851,11 @@
       <w:pPr>
         <w:pStyle w:val="Heading3"/>
       </w:pPr>
-      <w:bookmarkStart w:id="47" w:name="limitações"/>
+      <w:bookmarkStart w:id="49" w:name="limitações"/>
       <w:r>
         <w:t xml:space="preserve">4.6 Limitações</w:t>
       </w:r>
-      <w:bookmarkEnd w:id="47"/>
+      <w:bookmarkEnd w:id="49"/>
     </w:p>
     <w:p>
       <w:pPr>
@@ -5887,11 +6043,11 @@
       <w:pPr>
         <w:pStyle w:val="Heading2"/>
       </w:pPr>
-      <w:bookmarkStart w:id="48" w:name="conclusão"/>
+      <w:bookmarkStart w:id="50" w:name="conclusão"/>
       <w:r>
         <w:t xml:space="preserve">5 Conclusão</w:t>
       </w:r>
-      <w:bookmarkEnd w:id="48"/>
+      <w:bookmarkEnd w:id="50"/>
     </w:p>
     <w:p>
       <w:pPr>
@@ -6249,11 +6405,11 @@
       <w:pPr>
         <w:pStyle w:val="Heading2"/>
       </w:pPr>
-      <w:bookmarkStart w:id="49" w:name="agradecimentos"/>
+      <w:bookmarkStart w:id="51" w:name="agradecimentos"/>
       <w:r>
         <w:t xml:space="preserve">Agradecimentos</w:t>
       </w:r>
-      <w:bookmarkEnd w:id="49"/>
+      <w:bookmarkEnd w:id="51"/>
     </w:p>
     <w:p>
       <w:pPr>
@@ -6309,11 +6465,11 @@
       <w:pPr>
         <w:pStyle w:val="Heading2"/>
       </w:pPr>
-      <w:bookmarkStart w:id="50" w:name="financiamento"/>
+      <w:bookmarkStart w:id="52" w:name="financiamento"/>
       <w:r>
         <w:t xml:space="preserve">Financiamento</w:t>
       </w:r>
-      <w:bookmarkEnd w:id="50"/>
+      <w:bookmarkEnd w:id="52"/>
     </w:p>
     <w:p>
       <w:pPr>
@@ -6327,11 +6483,11 @@
       <w:pPr>
         <w:pStyle w:val="Heading2"/>
       </w:pPr>
-      <w:bookmarkStart w:id="51" w:name="conflito-de-interesses"/>
+      <w:bookmarkStart w:id="53" w:name="conflito-de-interesses"/>
       <w:r>
         <w:t xml:space="preserve">Conflito de interesses</w:t>
       </w:r>
-      <w:bookmarkEnd w:id="51"/>
+      <w:bookmarkEnd w:id="53"/>
     </w:p>
     <w:p>
       <w:pPr>
@@ -6345,11 +6501,11 @@
       <w:pPr>
         <w:pStyle w:val="Heading1"/>
       </w:pPr>
-      <w:bookmarkStart w:id="52" w:name="referências"/>
+      <w:bookmarkStart w:id="54" w:name="referências"/>
       <w:r>
         <w:t xml:space="preserve">REFERÊNCIAS</w:t>
       </w:r>
-      <w:bookmarkEnd w:id="52"/>
+      <w:bookmarkEnd w:id="54"/>
     </w:p>
     <w:p>
       <w:pPr>

</xml_diff>

<commit_message>
revisa o artigo com as figuras reais: 2 CRITICAL, 5 MAJOR, 4 corrigidos
Relatório em build/review-2026-09-20.md.

C-2 (corrigido): as Figuras 5 e 6 davam "Fonte: dados da pesquisa" ao modelo de
certificado, que o mapa de fatos §14 atribui à EMBRAPII. Passou a creditar o
modelo de documento do programa.
M-1 (corrigido): origem das quatro figuras novas agora nomeia arquivo e página.
M-2 (corrigido): 3.3 dizia dez medições e 4.1 onze linhas, para a mesma escrita.
M-3 (corrigido): a legenda da Figura 4 explica que a data do rótulo é a do
registro, não a da unidade.

Permanecem por decisão do autor: C-1 (19 páginas, D-30), M-4 (texto interno das
capturas abaixo de 18 pt) e M-5 (reuso de imagem de relatório protocolado).

Co-Authored-By: Claude Opus 5 <noreply@anthropic.com>
Claude-Session: https://claude.ai/code/session_01XNaMqyCQ4fzjdFJ9W5G7SS
</commit_message>
<xml_diff>
--- a/build/artigo.docx
+++ b/build/artigo.docx
@@ -2831,7 +2831,13 @@
         <w:pStyle w:val="BodyText"/>
       </w:pPr>
       <w:r>
-        <w:t xml:space="preserve">A gravação das dez medições de uma autoavaliação é executada registro a registro, na mesma</w:t>
+        <w:t xml:space="preserve">A gravação das onze linhas de uma autoavaliação, das quais dez são medições</w:t>
+      </w:r>
+      <w:r>
+        <w:t xml:space="preserve"> </w:t>
+      </w:r>
+      <w:r>
+        <w:t xml:space="preserve">independentes, é executada registro a registro, na mesma</w:t>
       </w:r>
       <w:r>
         <w:t xml:space="preserve"> </w:t>
@@ -4621,7 +4627,7 @@
         <w:pStyle w:val="Legenda"/>
       </w:pPr>
       <w:r>
-        <w:t xml:space="preserve">Figura 4 — Relatório de perfil produzido pelo fluxo de geração de gráficos, com três avaliações sucessivas sobrepostas nos eixos das competências e a tabela dos níveis qualitativos correspondentes. Nome do discente suprimido.</w:t>
+        <w:t xml:space="preserve">Figura 4 — Relatório de perfil produzido pelo fluxo de geração de gráficos, com três avaliações sucessivas sobrepostas nos eixos das competências e a tabela dos níveis qualitativos correspondentes. A data que acompanha cada rótulo é a do registro da autoavaliação, não a da unidade avaliativa. Nome do discente suprimido.</w:t>
       </w:r>
     </w:p>
     <w:p>
@@ -4940,7 +4946,7 @@
         <w:pStyle w:val="FonteIlustracao"/>
       </w:pPr>
       <w:r>
-        <w:t xml:space="preserve">Fonte: dados da pesquisa.</w:t>
+        <w:t xml:space="preserve">Fonte: modelo de documento do programa Capacitação 4.0.</w:t>
       </w:r>
     </w:p>
     <w:p>
@@ -5003,7 +5009,7 @@
         <w:pStyle w:val="FonteIlustracao"/>
       </w:pPr>
       <w:r>
-        <w:t xml:space="preserve">Fonte: dados da pesquisa.</w:t>
+        <w:t xml:space="preserve">Fonte: modelo de documento do programa Capacitação 4.0.</w:t>
       </w:r>
     </w:p>
     <w:p>

</xml_diff>